<commit_message>
Actividad 3 - Clase 2
</commit_message>
<xml_diff>
--- a/Ejercicios/Clase 2/Actividad2.docx
+++ b/Ejercicios/Clase 2/Actividad2.docx
@@ -140,25 +140,7 @@
           <w:bCs/>
           <w:lang w:val="es-CR"/>
         </w:rPr>
-        <w:t xml:space="preserve">¿Por qué HTTP/2 no elimina completamente el HOL </w:t>
-      </w:r>
-      <w:proofErr w:type="spellStart"/>
-      <w:r>
-        <w:rPr>
-          <w:b/>
-          <w:bCs/>
-          <w:lang w:val="es-CR"/>
-        </w:rPr>
-        <w:t>Blocking</w:t>
-      </w:r>
-      <w:proofErr w:type="spellEnd"/>
-      <w:r>
-        <w:rPr>
-          <w:b/>
-          <w:bCs/>
-          <w:lang w:val="es-CR"/>
-        </w:rPr>
-        <w:t>?</w:t>
+        <w:t>¿Por qué HTTP/2 no elimina completamente el HOL Blocking?</w:t>
       </w:r>
     </w:p>
     <w:p>
@@ -172,21 +154,7 @@
         <w:rPr>
           <w:lang w:val="es-CR"/>
         </w:rPr>
-        <w:t xml:space="preserve">HTTP/2 resuelve el HOL </w:t>
-      </w:r>
-      <w:proofErr w:type="spellStart"/>
-      <w:r>
-        <w:rPr>
-          <w:lang w:val="es-CR"/>
-        </w:rPr>
-        <w:t>Blocking</w:t>
-      </w:r>
-      <w:proofErr w:type="spellEnd"/>
-      <w:r>
-        <w:rPr>
-          <w:lang w:val="es-CR"/>
-        </w:rPr>
-        <w:t xml:space="preserve"> a nivel de aplicación</w:t>
+        <w:t>HTTP/2 resuelve el HOL Blocking a nivel de aplicación</w:t>
       </w:r>
       <w:r>
         <w:rPr>
@@ -306,7 +274,6 @@
         </w:rPr>
         <w:t xml:space="preserve">Técnicamente sí porque este resuelve el HOL </w:t>
       </w:r>
-      <w:proofErr w:type="spellStart"/>
       <w:proofErr w:type="gramStart"/>
       <w:r>
         <w:rPr>
@@ -314,7 +281,6 @@
         </w:rPr>
         <w:t>Blocking</w:t>
       </w:r>
-      <w:proofErr w:type="spellEnd"/>
       <w:proofErr w:type="gramEnd"/>
       <w:r>
         <w:rPr>

</xml_diff>